<commit_message>
Improve PHY1001 lecture visuals
</commit_message>
<xml_diff>
--- a/exams/2025-1 일반물리중간시험.docx
+++ b/exams/2025-1 일반물리중간시험.docx
@@ -675,7 +675,6 @@
         </w:rPr>
         <w:t xml:space="preserve"> </w:t>
       </w:r>
-      <w:proofErr w:type="spellStart"/>
       <w:r>
         <w:rPr>
           <w:rFonts w:hint="eastAsia"/>
@@ -685,7 +684,6 @@
         </w:rPr>
         <w:t>표현하시오</w:t>
       </w:r>
-      <w:proofErr w:type="spellEnd"/>
       <w:r>
         <w:rPr>
           <w:rFonts w:hint="eastAsia"/>
@@ -920,7 +918,6 @@
           <m:t>)</m:t>
         </m:r>
       </m:oMath>
-      <w:proofErr w:type="spellStart"/>
       <w:r>
         <w:rPr>
           <w:rFonts w:hint="eastAsia"/>
@@ -930,7 +927,6 @@
         </w:rPr>
         <w:t>를</w:t>
       </w:r>
-      <w:proofErr w:type="spellEnd"/>
       <w:r>
         <w:rPr>
           <w:rFonts w:hint="eastAsia"/>
@@ -2357,7 +2353,6 @@
           <m:t>,g</m:t>
         </m:r>
       </m:oMath>
-      <w:proofErr w:type="spellStart"/>
       <w:r>
         <w:rPr>
           <w:rFonts w:hint="eastAsia"/>
@@ -2367,7 +2362,6 @@
         </w:rPr>
         <w:t>를</w:t>
       </w:r>
-      <w:proofErr w:type="spellEnd"/>
       <w:r>
         <w:rPr>
           <w:rFonts w:hint="eastAsia"/>
@@ -2395,7 +2389,6 @@
         </w:rPr>
         <w:t xml:space="preserve"> </w:t>
       </w:r>
-      <w:proofErr w:type="spellStart"/>
       <w:r>
         <w:rPr>
           <w:rFonts w:hint="eastAsia"/>
@@ -2405,7 +2398,6 @@
         </w:rPr>
         <w:t>표현하시오</w:t>
       </w:r>
-      <w:proofErr w:type="spellEnd"/>
       <w:r>
         <w:rPr>
           <w:rFonts w:hint="eastAsia"/>
@@ -3812,7 +3804,6 @@
           <m:t>v</m:t>
         </m:r>
       </m:oMath>
-      <w:proofErr w:type="spellStart"/>
       <w:r>
         <w:rPr>
           <w:rFonts w:hint="eastAsia"/>
@@ -3822,17 +3813,15 @@
         </w:rPr>
         <w:t>를</w:t>
       </w:r>
-      <w:proofErr w:type="spellEnd"/>
-      <w:r>
-        <w:rPr>
-          <w:rFonts w:hint="eastAsia"/>
-          <w:sz w:val="20"/>
-          <w:szCs w:val="20"/>
-          <w:lang w:val="en-US"/>
-        </w:rPr>
-        <w:t xml:space="preserve"> </w:t>
-      </w:r>
-      <w:proofErr w:type="spellStart"/>
+      <w:r>
+        <w:rPr>
+          <w:rFonts w:hint="eastAsia"/>
+          <w:sz w:val="20"/>
+          <w:szCs w:val="20"/>
+          <w:lang w:val="en-US"/>
+        </w:rPr>
+        <w:t xml:space="preserve"> </w:t>
+      </w:r>
       <w:r>
         <w:rPr>
           <w:rFonts w:hint="eastAsia"/>
@@ -3842,7 +3831,6 @@
         </w:rPr>
         <w:t>구하시오</w:t>
       </w:r>
-      <w:proofErr w:type="spellEnd"/>
       <w:r>
         <w:rPr>
           <w:rFonts w:hint="eastAsia"/>
@@ -4511,7 +4499,6 @@
         </w:rPr>
         <w:t xml:space="preserve"> </w:t>
       </w:r>
-      <w:proofErr w:type="spellStart"/>
       <w:r>
         <w:rPr>
           <w:rFonts w:hint="eastAsia"/>
@@ -4521,7 +4508,6 @@
         </w:rPr>
         <w:t>구하시오</w:t>
       </w:r>
-      <w:proofErr w:type="spellEnd"/>
       <w:r>
         <w:rPr>
           <w:rFonts w:hint="eastAsia"/>
@@ -4722,7 +4708,6 @@
           <m:t>d</m:t>
         </m:r>
       </m:oMath>
-      <w:proofErr w:type="spellStart"/>
       <w:r>
         <w:rPr>
           <w:rFonts w:hint="eastAsia"/>
@@ -4732,17 +4717,15 @@
         </w:rPr>
         <w:t>를</w:t>
       </w:r>
-      <w:proofErr w:type="spellEnd"/>
-      <w:r>
-        <w:rPr>
-          <w:rFonts w:hint="eastAsia"/>
-          <w:sz w:val="20"/>
-          <w:szCs w:val="20"/>
-          <w:lang w:val="en-US"/>
-        </w:rPr>
-        <w:t xml:space="preserve"> </w:t>
-      </w:r>
-      <w:proofErr w:type="spellStart"/>
+      <w:r>
+        <w:rPr>
+          <w:rFonts w:hint="eastAsia"/>
+          <w:sz w:val="20"/>
+          <w:szCs w:val="20"/>
+          <w:lang w:val="en-US"/>
+        </w:rPr>
+        <w:t xml:space="preserve"> </w:t>
+      </w:r>
       <w:r>
         <w:rPr>
           <w:rFonts w:hint="eastAsia"/>
@@ -4752,7 +4735,6 @@
         </w:rPr>
         <w:t>구하시오</w:t>
       </w:r>
-      <w:proofErr w:type="spellEnd"/>
       <w:r>
         <w:rPr>
           <w:rFonts w:hint="eastAsia"/>
@@ -5874,6 +5856,7 @@
           <m:t>ω</m:t>
         </m:r>
       </m:oMath>
+      <w:proofErr w:type="spellStart"/>
       <w:r>
         <w:rPr>
           <w:rFonts w:hint="eastAsia"/>
@@ -5883,16 +5866,16 @@
         </w:rPr>
         <w:t>를</w:t>
       </w:r>
-      <w:r>
-        <w:rPr>
-          <w:rFonts w:hint="eastAsia"/>
-          <w:sz w:val="20"/>
-          <w:szCs w:val="20"/>
-          <w:lang w:val="en-US"/>
-        </w:rPr>
-        <w:t xml:space="preserve"> </w:t>
-      </w:r>
-      <w:proofErr w:type="spellStart"/>
+      <w:proofErr w:type="spellEnd"/>
+      <w:r>
+        <w:rPr>
+          <w:rFonts w:hint="eastAsia"/>
+          <w:sz w:val="20"/>
+          <w:szCs w:val="20"/>
+          <w:lang w:val="en-US"/>
+        </w:rPr>
+        <w:t xml:space="preserve"> </w:t>
+      </w:r>
       <w:r>
         <w:rPr>
           <w:rFonts w:hint="eastAsia"/>
@@ -5902,7 +5885,6 @@
         </w:rPr>
         <w:t>구하시오</w:t>
       </w:r>
-      <w:proofErr w:type="spellEnd"/>
       <w:r>
         <w:rPr>
           <w:rFonts w:hint="eastAsia"/>
@@ -6036,7 +6018,6 @@
         </w:rPr>
         <w:t xml:space="preserve"> </w:t>
       </w:r>
-      <w:proofErr w:type="spellStart"/>
       <w:r>
         <w:rPr>
           <w:rFonts w:hint="eastAsia"/>
@@ -6046,7 +6027,6 @@
         </w:rPr>
         <w:t>구하시오</w:t>
       </w:r>
-      <w:proofErr w:type="spellEnd"/>
       <w:r>
         <w:rPr>
           <w:rFonts w:hint="eastAsia"/>
@@ -7599,6 +7579,7 @@
   <w:style w:type="character" w:default="1" w:styleId="DefaultParagraphFont">
     <w:name w:val="Default Paragraph Font"/>
     <w:uiPriority w:val="1"/>
+    <w:semiHidden/>
     <w:unhideWhenUsed/>
   </w:style>
   <w:style w:type="table" w:default="1" w:styleId="TableNormal">

</xml_diff>